<commit_message>
Document the finished dashboard and the bugs it exposed
- README: replace the "work in progress" note with the headline results,
  show all five dashboard pages, add how to open the .pbix, and drop the
  outdated notes about empty prices and a blocked build kpi step
- Rename the page 3 screenshot to 03_airlines_and_aircraft.png, which
  was clashing with the 02_ prefix
- Roadmap and summary doc: mark the dashboard done, log the aircraft-name,
  cargo-flag and rebuild fixes, and move the next steps up
- Walkthrough: explain how manufacturer/model and is_cargo are filled
</commit_message>
<xml_diff>
--- a/files/Project_Summary.docx
+++ b/files/Project_Summary.docx
@@ -36,7 +36,7 @@
           <w:color w:val="666666"/>
           <w:sz w:val="20"/>
         </w:rPr>
-        <w:t>Last updated: 26 September 2026</w:t>
+        <w:t>Last updated: 11 October 2026</w:t>
       </w:r>
     </w:p>
     <w:p/>
@@ -3442,7 +3442,7 @@
               <w:rPr>
                 <w:sz w:val="18"/>
               </w:rPr>
-              <w:t>21,224</w:t>
+              <w:t>31,894</w:t>
             </w:r>
           </w:p>
         </w:tc>
@@ -13404,7 +13404,7 @@
               <w:rPr>
                 <w:sz w:val="18"/>
               </w:rPr>
-              <w:t>2026-09-23</w:t>
+              <w:t>2026-10-11</w:t>
             </w:r>
           </w:p>
         </w:tc>
@@ -13504,7 +13504,7 @@
               <w:rPr>
                 <w:sz w:val="18"/>
               </w:rPr>
-              <w:t>2026-09-23</w:t>
+              <w:t>2026-10-11</w:t>
             </w:r>
           </w:p>
         </w:tc>
@@ -14181,7 +14181,7 @@
               <w:rPr>
                 <w:sz w:val="18"/>
               </w:rPr>
-              <w:t>Not started</w:t>
+              <w:t>Done</w:t>
             </w:r>
           </w:p>
         </w:tc>
@@ -14195,7 +14195,7 @@
               <w:rPr>
                 <w:sz w:val="18"/>
               </w:rPr>
-              <w:t>Needs the prices, and is built by hand</w:t>
+              <w:t>Five pages, built on core.v_flight_kpi</w:t>
             </w:r>
           </w:p>
         </w:tc>
@@ -14973,6 +14973,94 @@
           </w:p>
         </w:tc>
       </w:tr>
+      <w:tr>
+        <w:tc>
+          <w:tcPr>
+            <w:tcW w:type="dxa" w:w="1300"/>
+          </w:tcPr>
+          <w:p>
+            <w:r/>
+            <w:r>
+              <w:rPr>
+                <w:sz w:val="18"/>
+              </w:rPr>
+              <w:t>2026-10-11</w:t>
+            </w:r>
+          </w:p>
+        </w:tc>
+        <w:tc>
+          <w:tcPr>
+            <w:tcW w:type="dxa" w:w="2200"/>
+          </w:tcPr>
+          <w:p>
+            <w:r/>
+            <w:r>
+              <w:rPr>
+                <w:sz w:val="18"/>
+              </w:rPr>
+              <w:t>Power BI dashboard built</w:t>
+            </w:r>
+          </w:p>
+        </w:tc>
+        <w:tc>
+          <w:tcPr>
+            <w:tcW w:type="dxa" w:w="5526"/>
+          </w:tcPr>
+          <w:p>
+            <w:r/>
+            <w:r>
+              <w:rPr>
+                <w:sz w:val="18"/>
+              </w:rPr>
+              <w:t>Five pages on top of core.v_flight_kpi: overview, routes and airports, airlines and aircraft, carbon cost, and data quality. Every KPI counts only flights that passed the quality checks. Power BI imports straight from PostgreSQL, so a pipeline rerun plus Refresh brings it up to date.</w:t>
+            </w:r>
+          </w:p>
+        </w:tc>
+      </w:tr>
+      <w:tr>
+        <w:tc>
+          <w:tcPr>
+            <w:tcW w:type="dxa" w:w="1300"/>
+          </w:tcPr>
+          <w:p>
+            <w:r/>
+            <w:r>
+              <w:rPr>
+                <w:sz w:val="18"/>
+              </w:rPr>
+              <w:t>2026-10-11</w:t>
+            </w:r>
+          </w:p>
+        </w:tc>
+        <w:tc>
+          <w:tcPr>
+            <w:tcW w:type="dxa" w:w="2200"/>
+          </w:tcPr>
+          <w:p>
+            <w:r/>
+            <w:r>
+              <w:rPr>
+                <w:sz w:val="18"/>
+              </w:rPr>
+              <w:t>Three bugs the dashboard exposed</w:t>
+            </w:r>
+          </w:p>
+        </w:tc>
+        <w:tc>
+          <w:tcPr>
+            <w:tcW w:type="dxa" w:w="5526"/>
+          </w:tcPr>
+          <w:p>
+            <w:r/>
+            <w:r>
+              <w:rPr>
+                <w:sz w:val="18"/>
+              </w:rPr>
+              <w:t>Aircraft types were named after the first registry entry alphabetically, so a misfiled glider renamed every B737; each type now takes the most common name. No airline was flagged as cargo, because loading flights wiped the flag and the name check missed 'Federal Express'; cargo is now also spotted by ICAO code (11 operators, 3,229 flights). And reloading aircraft data after the fuel step crashed on a foreign key; the rebuild now updates in place. Fuel, CO2 and cost totals were unchanged.</w:t>
+            </w:r>
+          </w:p>
+        </w:tc>
+      </w:tr>
     </w:tbl>
     <w:p/>
     <w:p>
@@ -14981,17 +15069,6 @@
       </w:pPr>
       <w:r>
         <w:t>16. What comes next</w:t>
-      </w:r>
-    </w:p>
-    <w:p>
-      <w:pPr>
-        <w:pStyle w:val="ListBullet"/>
-      </w:pPr>
-      <w:r>
-        <w:rPr>
-          <w:sz w:val="21"/>
-        </w:rPr>
-        <w:t>Build the Power BI report: overview, efficiency, and data quality pages.</w:t>
       </w:r>
     </w:p>
     <w:p>

</xml_diff>